<commit_message>
Update Cyber Warfare thesis - v1.0 final output with executive summary - Complete 4-phase thesis (Literature, Methodology, Results, Conclusion) - 15 papers analyzed with PRISMA flowchart - 72% approval-ready skeleton - Added executive summary - Quality checks: 7/8 passed - Ready for GitHub release
</commit_message>
<xml_diff>
--- a/output/cyber-warfare-conclusion.docx
+++ b/output/cyber-warfare-conclusion.docx
@@ -77,7 +77,52 @@
           <w:b w:val="0"/>
           <w:i/>
         </w:rPr>
-        <w:t xml:space="preserve"> for the direction you would pursue next.</w:t>
+        <w:t xml:space="preserve"> for the direction you would pursue next. Notes are labelled </w:t>
+      </w:r>
+      <w:r>
+        <w:rPr>
+          <w:b/>
+          <w:i/>
+          <w:highlight w:val="yellow"/>
+        </w:rPr>
+        <w:t>[USER MUST ADD]</w:t>
+      </w:r>
+      <w:r>
+        <w:rPr>
+          <w:b w:val="0"/>
+          <w:i/>
+        </w:rPr>
+        <w:t xml:space="preserve"> for your own data, results or argument; the text is incomplete without it; </w:t>
+      </w:r>
+      <w:r>
+        <w:rPr>
+          <w:b/>
+          <w:i/>
+          <w:highlight w:val="yellow"/>
+        </w:rPr>
+        <w:t>[USER SHOULD VERIFY]</w:t>
+      </w:r>
+      <w:r>
+        <w:rPr>
+          <w:b w:val="0"/>
+          <w:i/>
+        </w:rPr>
+        <w:t xml:space="preserve"> for an automatic judgement to check against the papers before submitting; </w:t>
+      </w:r>
+      <w:r>
+        <w:rPr>
+          <w:b/>
+          <w:i/>
+          <w:highlight w:val="yellow"/>
+        </w:rPr>
+        <w:t>[OPTIONAL POLISH]</w:t>
+      </w:r>
+      <w:r>
+        <w:rPr>
+          <w:b w:val="0"/>
+          <w:i/>
+        </w:rPr>
+        <w:t xml:space="preserve"> for an improvement that strengthens the text but is not required.</w:t>
       </w:r>
     </w:p>
     <w:p>
@@ -102,7 +147,7 @@
           <w:b w:val="0"/>
           <w:i w:val="0"/>
         </w:rPr>
-        <w:t>This narrative review brought together 15 studies on Cyber Warfare, published between 2023 and 2025, drawing on four studies using a conceptual / theoretical analysis (Yang et al., 2025; Diggelen et al., 2025; Li et al., 2024; Ear et al., 2023), three studies using an unclear from the abstract (Benkő et al., 2024; Bouke et al., 2023; Kiely et al., 2023), two studies using a computational experiment (benchmark evaluation) (Sánchez et al., 2025; Celeny et al., 2024), two studies using a case study (Yang et al., 2025; Lau et al., 2024), two studies using a systematic / scoping review (Ahmed et al., 2024; Huang et al., 2024) and two studies using a simulation / modelling study (Fernandes et al., 2024; Li et al., 2023). The field agrees most clearly on challenges associated (Li et al., 2024; Bouke et al., 2023; low confidence). Taken as a whole, the evidence is limited: some studies report samples or statistics, but no finding is firmly replicated.</w:t>
+        <w:t>This narrative review brought together 15 studies on Cyber Warfare, published between 2023 and 2025, drawing on eight studies whose design is unclear from the abstract (Huang, 2024; Ma et al., 2024; Unknown, 2023; Cremer et al., 2024; Sfetcu, 2024; Rosli, 2025; Khoirunnisa et al., 2024; Mohammed, 2025), two studies using a mixed-methods design (Kumar et al., 2024; Žilinčík et al., 2023), two studies using a case study (Lindsay, 2025; Khan, 2025), a cross-sectional survey (Siam et al., 2025), a computational experiment (benchmark evaluation) (Wang et al., 2024) and a narrative literature review (Mohamed et al., 2023). It is divided on attacks and ukraine (Kumar et al., 2024; Khoirunnisa et al., 2024), threat and detection (Siam et al., 2025; Sfetcu, 2024) and security and national (Rosli, 2025; Khoirunnisa et al., 2024). Taken as a whole, the evidence is limited: some studies report samples or statistics, but no finding is firmly replicated. The studies themselves leave open limitations the authors acknowledge, limitations the authors acknowledge, limitations the authors acknowledge, limitations the authors acknowledge, limitations the authors acknowledge, limitations the authors acknowledge, few real-world cases, limited generalisability, limitations the authors acknowledge, limitations the authors acknowledge, limitations the authors acknowledge, limitations the authors acknowledge, limitations the authors acknowledge, limitations the authors acknowledge and limitations the authors acknowledge.</w:t>
       </w:r>
     </w:p>
     <w:p>
@@ -119,7 +164,7 @@
           <w:b w:val="0"/>
           <w:i w:val="0"/>
         </w:rPr>
-        <w:t>The proposed study uses a mixed-methods design because the reviewed studies used quantitative and qualitative designs separately, and combining them lets each strand explain or test the other. Its strands, a computational experiment (benchmark evaluation) and a case study, mirror the reviewed studies' own designs. Four reviewed studies use the same design or one of its strands, so its results will be directly comparable. It answers the review's gaps by testing the findings in a new setting and adding new empirical data where the literature rests on argument.</w:t>
+        <w:t>The proposed study uses a mixed-methods design because the reviewed studies used quantitative and qualitative designs separately, and combining them lets each strand explain or test the other. Its strands, a cross-sectional survey and a case study, mirror the reviewed studies' own designs. Five reviewed studies use the same design or one of its strands, so its results will be directly comparable. It answers the review's gaps by testing the findings in a new setting and adding new empirical data where the literature rests on argument.</w:t>
       </w:r>
     </w:p>
     <w:p>
@@ -136,7 +181,7 @@
           <w:b w:val="0"/>
           <w:i w:val="0"/>
         </w:rPr>
-        <w:t>Across the studies, the analysis identified one finding reported by more than one study: one pointing the same way and none that do not. The best-supported concerns challenges associated, backed by two studies with low confidence overall. Rated one by one, the studies give three medium-confidence results and 12 low-confidence results, and none quantifies its effects in the abstract.</w:t>
+        <w:t>Across the studies, the analysis identified three findings reported by more than one study: none pointing the same way and three that do not. The best-supported concerns threat and detection, backed by two studies with medium confidence overall. Rated one by one, the studies give one high-confidence result, one medium-confidence result and 13 low-confidence results, and only Siam et al. (2025) quantifies its effects.</w:t>
       </w:r>
     </w:p>
     <w:p>
@@ -153,7 +198,7 @@
           <w:b w:val="0"/>
           <w:i w:val="0"/>
         </w:rPr>
-        <w:t xml:space="preserve"> Summarise your own main results in two or three sentences: what you found on challenges associated, and whether it agrees with the reviewed studies.</w:t>
+        <w:t xml:space="preserve"> Summarise your own main results in two or three sentences: what you found on attacks and ukraine, threat and detection and security and national, and whether it agrees with the reviewed studies.</w:t>
       </w:r>
     </w:p>
     <w:p>
@@ -170,7 +215,7 @@
           <w:b w:val="0"/>
           <w:i w:val="0"/>
         </w:rPr>
-        <w:t>This study can advance research on Cyber Warfare by providing new mixed methods evidence on a topic where the existing evidence is limited and an independent check of findings so far reported by one study only.</w:t>
+        <w:t>This narrative review itself adds to the field by bringing 15 studies on Cyber Warfare together across six research designs, identifying three findings reported by more than one study and separating consistent from contested evidence, and turning 15 gaps into 12 concrete directions with a matched design (a mixed-methods design). Building on it, this study can advance research on Cyber Warfare by providing new mixed methods evidence on a topic where the existing evidence is limited, a test of the conditions under which attacks and ukraine, threat and detection and security and national holds and an independent check of findings so far reported by one study only.</w:t>
       </w:r>
     </w:p>
     <w:p>
@@ -204,7 +249,7 @@
           <w:b w:val="0"/>
           <w:i w:val="0"/>
         </w:rPr>
-        <w:t>The reviewed studies point to validation beyond the datasets used (Yang et al., 2025; Ear et al., 2023), limitations the authors acknowledge (Diggelen et al., 2025; Ahmed et al., 2024; Huang et al., 2024; Li et al., 2024; Fernandes et al., 2024; Benkő et al., 2024; Lau et al., 2024; Bouke et al., 2023; Kiely et al., 2023), limited generalisability (Sánchez et al., 2025; Celeny et al., 2024; Li et al., 2023) and untested scalability (Yang et al., 2025). The results of Yang et al. (2025), Diggelen et al. (2025), Sánchez et al. (2025), Yang et al. (2025), Li et al. (2024), Fernandes et al. (2024), Benkő et al. (2024), Lau et al. (2024), Ear et al. (2023), Bouke et al. (2023), Kiely et al. (2023) and Li et al. (2023) rest on thin reported evidence, which weakens any conclusion built on them. The proposed design has limits of its own: a mixed-methods design demands skills in two traditions and careful integration of its strands, which takes time. Within it, a computational experiment (benchmark evaluation) on benchmarks may not predict behaviour in deployment and a case study of few cases supports analytic rather than statistical generalisation. Finally, the review itself was assembled automatically from abstracts, and papers were chosen by relevance and citations rather than fixed criteria, so studies or details outside them may be missing.</w:t>
+        <w:t>The reviewed studies point to emerging issues left unexplored (Kumar et al., 2024), limitations the authors acknowledge (Kumar et al., 2024; Huang, 2024; Siam et al., 2025; Ma et al., 2024; Unknown, 2023; Cremer et al., 2024; Mohamed et al., 2023; Sfetcu, 2024; Khan, 2025; Rosli, 2025; Khoirunnisa et al., 2024; Mohammed, 2025; Žilinčík et al., 2023), few real-world cases (Lindsay, 2025) and limited generalisability (Wang et al., 2024). The results of Kumar et al. (2024), Huang (2024), Ma et al. (2024), Unknown (2023), Cremer et al. (2024), Lindsay (2025), Mohamed et al. (2023), Sfetcu (2024), Khan (2025), Rosli (2025), Khoirunnisa et al. (2024), Mohammed (2025) and Žilinčík et al. (2023) rest on thin reported evidence, which weakens any conclusion built on them. The proposed design has limits of its own: a mixed-methods design demands skills in two traditions and careful integration of its strands, which takes time. Within it, a cross-sectional survey measured once cannot separate cause from effect, and self-reports can be biased and a case study of few cases supports analytic rather than statistical generalisation. The review itself was assembled automatically from abstracts, and papers were chosen by relevance and citations rather than fixed criteria, so studies or details outside them may be missing. Papers were selected by a ranking of relevance, citations and recency, which favours established, highly cited and English-language work and may under-represent recent, regional or non-English studies. Summaries, designs and findings were extracted automatically by rules and a local language model, so individual misreadings are possible and each extracted claim needs checking against the full text. Only six studies state where they were carried out (Ukraine, Russia, China, Estonia and Georgia), so the findings' geographic reach is narrower than the topic's.</w:t>
       </w:r>
     </w:p>
     <w:p>
@@ -225,6 +270,23 @@
       </w:r>
     </w:p>
     <w:p>
+      <w:r>
+        <w:rPr>
+          <w:b/>
+          <w:i/>
+          <w:highlight w:val="yellow"/>
+        </w:rPr>
+        <w:t>[USER SHOULD VERIFY]</w:t>
+      </w:r>
+      <w:r>
+        <w:rPr>
+          <w:b w:val="0"/>
+          <w:i/>
+        </w:rPr>
+        <w:t xml:space="preserve"> Check the review's own limitations above against how you searched: add any databases, languages or years you excluded, and remove any that do not apply.</w:t>
+      </w:r>
+    </w:p>
+    <w:p>
       <w:pPr>
         <w:pStyle w:val="Heading3"/>
       </w:pPr>
@@ -238,7 +300,7 @@
           <w:b w:val="0"/>
           <w:i w:val="0"/>
         </w:rPr>
-        <w:t>For practice, engineers and system developers should treat the finding on challenges associated as provisional. For policy, standards bodies and regulators should build on the consistent findings while funding their replication. For research, the most pressing open question is this: Do the frameworks and arguments put forward for Cyber Warfare hold up when tested against data? Sections 2 and 3 develop these implications and directions in turn.</w:t>
+        <w:t>For practice, engineers and system developers have no replicated finding to act on yet and should treat single-study results with caution. For policy, standards bodies and regulators should commission further evidence before acting. For research, the most pressing open question is this: Do the frameworks and arguments put forward for Cyber Warfare hold up when tested against data? Section 2 develops these implications, and Section 3 sets out 12 directions: limitations the authors acknowledge, limited generalisability, issues the studies leave open, disagreement on attacks and ukraine, disagreement on threat and detection, disagreement on security and national, transparent reporting of effects and samples, empirical tests of proposed frameworks, reproducible evaluation, replication of single-study findings, scaling up the evidence on Cyber Warfare and collaboration with the social sciences and human-computer interaction.</w:t>
       </w:r>
     </w:p>
     <w:p>
@@ -266,14 +328,14 @@
           <w:b/>
           <w:i w:val="0"/>
         </w:rPr>
-        <w:t>Challenges associated.</w:t>
+        <w:t>Contested findings.</w:t>
       </w:r>
       <w:r>
         <w:rPr>
           <w:b w:val="0"/>
           <w:i w:val="0"/>
         </w:rPr>
-        <w:t xml:space="preserve"> Engineers and system developers should treat the finding on challenges associated as provisional (Li et al., 2024; Bouke et al., 2023; low confidence).</w:t>
+        <w:t xml:space="preserve"> Practice on attacks and ukraine, threat and detection and security and national should not change until the disagreement between studies is resolved.</w:t>
       </w:r>
     </w:p>
     <w:p>
@@ -290,7 +352,7 @@
           <w:b w:val="0"/>
           <w:i w:val="0"/>
         </w:rPr>
-        <w:t>Standards bodies and regulators need evidence that is consistent across studies and settings. On that standard the current evidence is limited, and it comes from India. Policies built on it should be framed as pilots with built-in evaluation, and should fund the replication described in Section 3.</w:t>
+        <w:t>Standards bodies and regulators need evidence that is consistent across studies and settings. On that standard the current evidence is limited, and it comes from China, Estonia, Georgia, Iran and Russia. Policies built on it should be framed as pilots with built-in evaluation, and should fund the replication described in Section 3.</w:t>
       </w:r>
     </w:p>
     <w:p>
@@ -307,7 +369,7 @@
           <w:b w:val="0"/>
           <w:i w:val="0"/>
         </w:rPr>
-        <w:t>The agreement on challenges associated lends support to the explanations the studies offer for it, which theories of the field should incorporate. The frameworks proposed by Yang et al. (2025), Diggelen et al. (2025), Ahmed et al. (2024), Huang et al. (2024), Li et al. (2024), Benkő et al. (2024), Ear et al. (2023), Bouke et al. (2023) and Kiely et al. (2023) are theoretical contributions that remain to be tested empirically.</w:t>
+        <w:t>The disagreement on attacks and ukraine, threat and detection and security and national suggests the theories involved lack boundary conditions: they should say when the effect occurs, not only that it does. The frameworks proposed by Huang (2024), Ma et al. (2024), Unknown (2023), Cremer et al. (2024), Mohamed et al. (2023), Sfetcu (2024), Rosli (2025), Khoirunnisa et al. (2024) and Mohammed (2025) are theoretical contributions that remain to be tested empirically.</w:t>
       </w:r>
     </w:p>
     <w:p>
@@ -331,7 +393,7 @@
           <w:b w:val="0"/>
           <w:i w:val="0"/>
         </w:rPr>
-        <w:t xml:space="preserve"> The finding on challenges associated (Li et al., 2024; Bouke et al., 2023) is a candidate for design guidance once it is reproduced under a common evaluation protocol.</w:t>
+        <w:t xml:space="preserve"> No result is yet reproduced across studies, so none is ready to become a design standard; a shared benchmark and evaluation protocol would be the first step.</w:t>
       </w:r>
     </w:p>
     <w:p>
@@ -363,7 +425,86 @@
           <w:b w:val="0"/>
           <w:i w:val="0"/>
         </w:rPr>
-        <w:t xml:space="preserve"> Scale is raised by Fernandes et al. (2024), but behaviour at production scale (cost, latency, robustness) is not demonstrated.</w:t>
+        <w:t xml:space="preserve"> None of the studies tests its approach at production scale, which leaves cost, latency and robustness under real loads open.</w:t>
+      </w:r>
+    </w:p>
+    <w:p>
+      <w:pPr>
+        <w:pStyle w:val="Heading3"/>
+      </w:pPr>
+      <w:r>
+        <w:t>2.5 Guidance for practitioners</w:t>
+      </w:r>
+    </w:p>
+    <w:p>
+      <w:r>
+        <w:rPr>
+          <w:b w:val="0"/>
+          <w:i w:val="0"/>
+        </w:rPr>
+        <w:t>How engineers and system developers can use these findings now, before further research settles them:</w:t>
+      </w:r>
+    </w:p>
+    <w:p>
+      <w:r>
+        <w:rPr>
+          <w:b w:val="0"/>
+          <w:i w:val="0"/>
+        </w:rPr>
+        <w:t>1. Treat each finding as a hypothesis for your own setting: none is yet replicated across studies.</w:t>
+      </w:r>
+    </w:p>
+    <w:p>
+      <w:r>
+        <w:rPr>
+          <w:b w:val="0"/>
+          <w:i w:val="0"/>
+        </w:rPr>
+        <w:t>2. Pilot before scaling: try the change on a small scale with one clear success measure, a baseline and a fixed review date.</w:t>
+      </w:r>
+    </w:p>
+    <w:p>
+      <w:r>
+        <w:rPr>
+          <w:b w:val="0"/>
+          <w:i w:val="0"/>
+        </w:rPr>
+        <w:t>3. Hold back on attacks and ukraine, threat and detection and security and national until the studies' disagreement is resolved, or test both positions side by side in your pilot.</w:t>
+      </w:r>
+    </w:p>
+    <w:p>
+      <w:r>
+        <w:rPr>
+          <w:b w:val="0"/>
+          <w:i w:val="0"/>
+        </w:rPr>
+        <w:t>4. Check transfer to your context: the studies that name their setting were carried out in China, Estonia, Georgia and Iran, so compare their samples and conditions with yours before relying on the results.</w:t>
+      </w:r>
+    </w:p>
+    <w:p>
+      <w:r>
+        <w:rPr>
+          <w:b w:val="0"/>
+          <w:i w:val="0"/>
+        </w:rPr>
+        <w:t>5. Record outcomes after adoption and share them, so practice feeds the evidence the research gaps call for.</w:t>
+      </w:r>
+    </w:p>
+    <w:p>
+      <w:r>
+        <w:rPr>
+          <w:b/>
+          <w:i/>
+          <w:highlight w:val="yellow"/>
+        </w:rPr>
+        <w:t>[OPTIONAL POLISH]</w:t>
+      </w:r>
+      <w:r>
+        <w:rPr>
+          <w:b w:val="0"/>
+          <w:i/>
+        </w:rPr>
+        <w:t xml:space="preserve"> Tailor these steps to the organisation, sector or country your thesis addresses, and name the people who would carry them out.</w:t>
       </w:r>
     </w:p>
     <w:p>
@@ -397,14 +538,14 @@
           <w:b/>
           <w:i w:val="0"/>
         </w:rPr>
-        <w:t>Validation beyond the datasets used.</w:t>
+        <w:t>Limitations the authors acknowledge.</w:t>
       </w:r>
       <w:r>
         <w:rPr>
           <w:b w:val="0"/>
           <w:i w:val="0"/>
         </w:rPr>
-        <w:t xml:space="preserve"> Do the frameworks and arguments put forward for Cyber Warfare hold up when tested against data? Phase 1 records validation beyond the datasets used as a limitation of Yang et al. (2025).</w:t>
+        <w:t xml:space="preserve"> Do the frameworks and arguments put forward for Cyber Warfare hold up when tested against data? Phase 1 records limitations the authors acknowledge as a limitation of Huang (2024).</w:t>
       </w:r>
     </w:p>
     <w:p>
@@ -444,7 +585,7 @@
           <w:b w:val="0"/>
           <w:i w:val="0"/>
         </w:rPr>
-        <w:t xml:space="preserve"> Which findings on Cyber Warfare hold beyond the settings in which they were first observed? Phase 1 records limited generalisability as a limitation of Sánchez et al. (2025).</w:t>
+        <w:t xml:space="preserve"> Which findings on Cyber Warfare hold beyond the settings in which they were first observed? Phase 1 records limited generalisability as a limitation of Wang et al. (2024).</w:t>
       </w:r>
     </w:p>
     <w:p>
@@ -484,7 +625,7 @@
           <w:b w:val="0"/>
           <w:i w:val="0"/>
         </w:rPr>
-        <w:t xml:space="preserve"> Which of the issues the reviewed studies leave open matters most for Cyber Warfare, and can a new study settle it? Phase 1 records these limitations: untested scalability (Yang et al. (2025)), limitations the authors acknowledge (Ahmed et al. (2024)), limitations the authors acknowledge (Li et al. (2024)), limitations the authors acknowledge (Lau et al. (2024)), limitations the authors acknowledge (Bouke et al. (2023)) and limitations the authors acknowledge (Kiely et al. (2023)).</w:t>
+        <w:t xml:space="preserve"> Which of the issues the reviewed studies leave open matters most for Cyber Warfare, and can a new study settle it? Phase 1 records these limitations: limitations the authors acknowledge (Kumar et al. (2024)), limitations the authors acknowledge (Siam et al. (2025)), few real-world cases (Lindsay (2025)), limitations the authors acknowledge (Mohamed et al. (2023)), limitations the authors acknowledge (Khan (2025)) and limitations the authors acknowledge (Rosli (2025)).</w:t>
       </w:r>
     </w:p>
     <w:p>
@@ -512,6 +653,126 @@
       </w:r>
     </w:p>
     <w:p>
+      <w:r>
+        <w:rPr>
+          <w:b/>
+          <w:i w:val="0"/>
+        </w:rPr>
+        <w:t>Disagreement on attacks and ukraine.</w:t>
+      </w:r>
+      <w:r>
+        <w:rPr>
+          <w:b w:val="0"/>
+          <w:i w:val="0"/>
+        </w:rPr>
+        <w:t xml:space="preserve"> Under which conditions does attacks and ukraine hold, and why do the studies describe it differently? The studies reporting on it (Kumar et al., 2024; Khoirunnisa et al., 2024) were judged mixed in Phase 3.</w:t>
+      </w:r>
+    </w:p>
+    <w:p>
+      <w:pPr>
+        <w:pStyle w:val="ListBullet"/>
+      </w:pPr>
+      <w:r>
+        <w:rPr>
+          <w:b w:val="0"/>
+          <w:i w:val="0"/>
+        </w:rPr>
+        <w:t>*Next step:* Measure the outcome in the same way across the settings the studies cover, and test which differences (sample, setting, measure) explain the disagreement.</w:t>
+      </w:r>
+    </w:p>
+    <w:p>
+      <w:pPr>
+        <w:pStyle w:val="ListBullet"/>
+      </w:pPr>
+      <w:r>
+        <w:rPr>
+          <w:b w:val="0"/>
+          <w:i w:val="0"/>
+        </w:rPr>
+        <w:t>*Design:* Comparative study with shared measures. *Timeline:* 1–2 years. *Feasibility:* medium (the settings already studied give a starting point for case selection).</w:t>
+      </w:r>
+    </w:p>
+    <w:p>
+      <w:r>
+        <w:rPr>
+          <w:b/>
+          <w:i w:val="0"/>
+        </w:rPr>
+        <w:t>Disagreement on threat and detection.</w:t>
+      </w:r>
+      <w:r>
+        <w:rPr>
+          <w:b w:val="0"/>
+          <w:i w:val="0"/>
+        </w:rPr>
+        <w:t xml:space="preserve"> Under which conditions does threat and detection hold, and why do the studies describe it differently? The studies reporting on it (Siam et al., 2025; Sfetcu, 2024) were judged mixed in Phase 3.</w:t>
+      </w:r>
+    </w:p>
+    <w:p>
+      <w:pPr>
+        <w:pStyle w:val="ListBullet"/>
+      </w:pPr>
+      <w:r>
+        <w:rPr>
+          <w:b w:val="0"/>
+          <w:i w:val="0"/>
+        </w:rPr>
+        <w:t>*Next step:* Measure the outcome in the same way across the settings the studies cover, and test which differences (sample, setting, measure) explain the disagreement.</w:t>
+      </w:r>
+    </w:p>
+    <w:p>
+      <w:pPr>
+        <w:pStyle w:val="ListBullet"/>
+      </w:pPr>
+      <w:r>
+        <w:rPr>
+          <w:b w:val="0"/>
+          <w:i w:val="0"/>
+        </w:rPr>
+        <w:t>*Design:* Comparative study with shared measures. *Timeline:* 1–2 years. *Feasibility:* medium (the settings already studied give a starting point for case selection).</w:t>
+      </w:r>
+    </w:p>
+    <w:p>
+      <w:r>
+        <w:rPr>
+          <w:b/>
+          <w:i w:val="0"/>
+        </w:rPr>
+        <w:t>Disagreement on security and national.</w:t>
+      </w:r>
+      <w:r>
+        <w:rPr>
+          <w:b w:val="0"/>
+          <w:i w:val="0"/>
+        </w:rPr>
+        <w:t xml:space="preserve"> Under which conditions does security and national hold, and why do the studies describe it differently? The studies reporting on it (Rosli, 2025; Khoirunnisa et al., 2024) were judged mixed in Phase 3.</w:t>
+      </w:r>
+    </w:p>
+    <w:p>
+      <w:pPr>
+        <w:pStyle w:val="ListBullet"/>
+      </w:pPr>
+      <w:r>
+        <w:rPr>
+          <w:b w:val="0"/>
+          <w:i w:val="0"/>
+        </w:rPr>
+        <w:t>*Next step:* Measure the outcome in the same way across the settings the studies cover, and test which differences (sample, setting, measure) explain the disagreement.</w:t>
+      </w:r>
+    </w:p>
+    <w:p>
+      <w:pPr>
+        <w:pStyle w:val="ListBullet"/>
+      </w:pPr>
+      <w:r>
+        <w:rPr>
+          <w:b w:val="0"/>
+          <w:i w:val="0"/>
+        </w:rPr>
+        <w:t>*Design:* Comparative study with shared measures. *Timeline:* 1–2 years. *Feasibility:* medium (the settings already studied give a starting point for case selection).</w:t>
+      </w:r>
+    </w:p>
+    <w:p>
       <w:pPr>
         <w:pStyle w:val="Heading3"/>
       </w:pPr>
@@ -532,7 +793,7 @@
           <w:b w:val="0"/>
           <w:i w:val="0"/>
         </w:rPr>
-        <w:t xml:space="preserve"> How large are the effects behind the findings on Cyber Warfare, and how precisely are they estimated? The abstracts of Sánchez et al. (2025), Yang et al. (2025), Fernandes et al. (2024), Celeny et al. (2024), Lau et al. (2024) and Li et al. (2023) give no effect sizes and sample sizes.</w:t>
+        <w:t xml:space="preserve"> How large are the effects behind the findings on Cyber Warfare, and how precisely are they estimated? The abstracts of Kumar et al. (2024), Lindsay (2025), Wang et al. (2024), Khan (2025) and Žilinčík et al. (2023) give no effect sizes and sample sizes.</w:t>
       </w:r>
     </w:p>
     <w:p>
@@ -572,7 +833,7 @@
           <w:b w:val="0"/>
           <w:i w:val="0"/>
         </w:rPr>
-        <w:t xml:space="preserve"> Do the frameworks and arguments that rest on no new data stand up to testing? Yang et al. (2025), Diggelen et al. (2025), Ahmed et al. (2024), Huang et al. (2024), Li et al. (2024), Benkő et al. (2024), Ear et al. (2023), Bouke et al. (2023) and Kiely et al. (2023) collected no new data.</w:t>
+        <w:t xml:space="preserve"> Do the frameworks and arguments that rest on no new data stand up to testing? Huang (2024), Ma et al. (2024), Unknown (2023), Cremer et al. (2024), Mohamed et al. (2023), Sfetcu (2024), Rosli (2025), Khoirunnisa et al. (2024) and Mohammed (2025) collected no new data.</w:t>
       </w:r>
     </w:p>
     <w:p>
@@ -660,7 +921,7 @@
           <w:b w:val="0"/>
           <w:i w:val="0"/>
         </w:rPr>
-        <w:t xml:space="preserve"> Which single-study findings survive an independent replication? The findings of Sánchez et al. (2025), Yang et al. (2025), Fernandes et al. (2024), Celeny et al. (2024), Lau et al. (2024) and Li et al. (2023) have not been reported by any other reviewed study.</w:t>
+        <w:t xml:space="preserve"> Which single-study findings survive an independent replication? The findings of Lindsay (2025), Wang et al. (2024), Khan (2025) and Žilinčík et al. (2023) have not been reported by any other reviewed study.</w:t>
       </w:r>
     </w:p>
     <w:p>
@@ -693,14 +954,14 @@
           <w:b/>
           <w:i w:val="0"/>
         </w:rPr>
-        <w:t>Scaling up the evidence on challenges associated.</w:t>
+        <w:t>Scaling up the evidence on Cyber Warfare.</w:t>
       </w:r>
       <w:r>
         <w:rPr>
           <w:b w:val="0"/>
           <w:i w:val="0"/>
         </w:rPr>
-        <w:t xml:space="preserve"> Does what is known about challenges associated hold at larger scale and in other settings? The evidence so far comes from India.</w:t>
+        <w:t xml:space="preserve"> Does what is known about Cyber Warfare hold at larger scale and in other settings? The evidence so far comes from Estonia, Georgia, Ukraine, Iran, Russia, China and United States.</w:t>
       </w:r>
     </w:p>
     <w:p>
@@ -712,7 +973,7 @@
           <w:b w:val="0"/>
           <w:i w:val="0"/>
         </w:rPr>
-        <w:t>*Next step:* Evaluate challenges associated at realistic scale: larger datasets, real deployment conditions and the hardware it would run on, reporting cost and latency as well as accuracy.</w:t>
+        <w:t>*Next step:* Test Cyber Warfare in a larger, more varied sample; detecting a small effect (d = 0.2) at 80% power takes about 394 participants per group.</w:t>
       </w:r>
     </w:p>
     <w:p>
@@ -724,7 +985,7 @@
           <w:b w:val="0"/>
           <w:i w:val="0"/>
         </w:rPr>
-        <w:t>*Design:* Scaled evaluation or field deployment. *Timeline:* 6–18 months. *Feasibility:* medium (depends on compute and on partners for real deployments).</w:t>
+        <w:t>*Design:* Multi-site study. *Timeline:* 1–2 years. *Feasibility:* medium (large samples need several recruitment sites).</w:t>
       </w:r>
     </w:p>
     <w:p>
@@ -879,7 +1140,7 @@
                 <w:b w:val="0"/>
                 <w:sz w:val="16"/>
               </w:rPr>
-              <w:t>Validation beyond the datasets used</w:t>
+              <w:t>Limitations the authors acknowledge</w:t>
             </w:r>
           </w:p>
         </w:tc>
@@ -1052,6 +1313,222 @@
                 <w:sz w:val="16"/>
               </w:rPr>
               <w:t>Mixed-methods design, as proposed in Phase 2</w:t>
+            </w:r>
+          </w:p>
+        </w:tc>
+        <w:tc>
+          <w:tcPr>
+            <w:tcW w:type="dxa" w:w="1728"/>
+          </w:tcPr>
+          <w:p>
+            <w:r>
+              <w:rPr>
+                <w:b w:val="0"/>
+                <w:sz w:val="16"/>
+              </w:rPr>
+              <w:t>1–2 years</w:t>
+            </w:r>
+          </w:p>
+        </w:tc>
+        <w:tc>
+          <w:tcPr>
+            <w:tcW w:type="dxa" w:w="1728"/>
+          </w:tcPr>
+          <w:p>
+            <w:r>
+              <w:rPr>
+                <w:b w:val="0"/>
+                <w:sz w:val="16"/>
+              </w:rPr>
+              <w:t>Medium</w:t>
+            </w:r>
+          </w:p>
+        </w:tc>
+      </w:tr>
+      <w:tr>
+        <w:tc>
+          <w:tcPr>
+            <w:tcW w:type="dxa" w:w="1728"/>
+          </w:tcPr>
+          <w:p>
+            <w:r>
+              <w:rPr>
+                <w:b w:val="0"/>
+                <w:sz w:val="16"/>
+              </w:rPr>
+              <w:t>Disagreement on attacks and ukraine</w:t>
+            </w:r>
+          </w:p>
+        </w:tc>
+        <w:tc>
+          <w:tcPr>
+            <w:tcW w:type="dxa" w:w="1728"/>
+          </w:tcPr>
+          <w:p>
+            <w:r>
+              <w:rPr>
+                <w:b w:val="0"/>
+                <w:sz w:val="16"/>
+              </w:rPr>
+              <w:t>Unanswered questions</w:t>
+            </w:r>
+          </w:p>
+        </w:tc>
+        <w:tc>
+          <w:tcPr>
+            <w:tcW w:type="dxa" w:w="1728"/>
+          </w:tcPr>
+          <w:p>
+            <w:r>
+              <w:rPr>
+                <w:b w:val="0"/>
+                <w:sz w:val="16"/>
+              </w:rPr>
+              <w:t>Comparative study with shared measures</w:t>
+            </w:r>
+          </w:p>
+        </w:tc>
+        <w:tc>
+          <w:tcPr>
+            <w:tcW w:type="dxa" w:w="1728"/>
+          </w:tcPr>
+          <w:p>
+            <w:r>
+              <w:rPr>
+                <w:b w:val="0"/>
+                <w:sz w:val="16"/>
+              </w:rPr>
+              <w:t>1–2 years</w:t>
+            </w:r>
+          </w:p>
+        </w:tc>
+        <w:tc>
+          <w:tcPr>
+            <w:tcW w:type="dxa" w:w="1728"/>
+          </w:tcPr>
+          <w:p>
+            <w:r>
+              <w:rPr>
+                <w:b w:val="0"/>
+                <w:sz w:val="16"/>
+              </w:rPr>
+              <w:t>Medium</w:t>
+            </w:r>
+          </w:p>
+        </w:tc>
+      </w:tr>
+      <w:tr>
+        <w:tc>
+          <w:tcPr>
+            <w:tcW w:type="dxa" w:w="1728"/>
+          </w:tcPr>
+          <w:p>
+            <w:r>
+              <w:rPr>
+                <w:b w:val="0"/>
+                <w:sz w:val="16"/>
+              </w:rPr>
+              <w:t>Disagreement on threat and detection</w:t>
+            </w:r>
+          </w:p>
+        </w:tc>
+        <w:tc>
+          <w:tcPr>
+            <w:tcW w:type="dxa" w:w="1728"/>
+          </w:tcPr>
+          <w:p>
+            <w:r>
+              <w:rPr>
+                <w:b w:val="0"/>
+                <w:sz w:val="16"/>
+              </w:rPr>
+              <w:t>Unanswered questions</w:t>
+            </w:r>
+          </w:p>
+        </w:tc>
+        <w:tc>
+          <w:tcPr>
+            <w:tcW w:type="dxa" w:w="1728"/>
+          </w:tcPr>
+          <w:p>
+            <w:r>
+              <w:rPr>
+                <w:b w:val="0"/>
+                <w:sz w:val="16"/>
+              </w:rPr>
+              <w:t>Comparative study with shared measures</w:t>
+            </w:r>
+          </w:p>
+        </w:tc>
+        <w:tc>
+          <w:tcPr>
+            <w:tcW w:type="dxa" w:w="1728"/>
+          </w:tcPr>
+          <w:p>
+            <w:r>
+              <w:rPr>
+                <w:b w:val="0"/>
+                <w:sz w:val="16"/>
+              </w:rPr>
+              <w:t>1–2 years</w:t>
+            </w:r>
+          </w:p>
+        </w:tc>
+        <w:tc>
+          <w:tcPr>
+            <w:tcW w:type="dxa" w:w="1728"/>
+          </w:tcPr>
+          <w:p>
+            <w:r>
+              <w:rPr>
+                <w:b w:val="0"/>
+                <w:sz w:val="16"/>
+              </w:rPr>
+              <w:t>Medium</w:t>
+            </w:r>
+          </w:p>
+        </w:tc>
+      </w:tr>
+      <w:tr>
+        <w:tc>
+          <w:tcPr>
+            <w:tcW w:type="dxa" w:w="1728"/>
+          </w:tcPr>
+          <w:p>
+            <w:r>
+              <w:rPr>
+                <w:b w:val="0"/>
+                <w:sz w:val="16"/>
+              </w:rPr>
+              <w:t>Disagreement on security and national</w:t>
+            </w:r>
+          </w:p>
+        </w:tc>
+        <w:tc>
+          <w:tcPr>
+            <w:tcW w:type="dxa" w:w="1728"/>
+          </w:tcPr>
+          <w:p>
+            <w:r>
+              <w:rPr>
+                <w:b w:val="0"/>
+                <w:sz w:val="16"/>
+              </w:rPr>
+              <w:t>Unanswered questions</w:t>
+            </w:r>
+          </w:p>
+        </w:tc>
+        <w:tc>
+          <w:tcPr>
+            <w:tcW w:type="dxa" w:w="1728"/>
+          </w:tcPr>
+          <w:p>
+            <w:r>
+              <w:rPr>
+                <w:b w:val="0"/>
+                <w:sz w:val="16"/>
+              </w:rPr>
+              <w:t>Comparative study with shared measures</w:t>
             </w:r>
           </w:p>
         </w:tc>
@@ -1383,7 +1860,7 @@
                 <w:b w:val="0"/>
                 <w:sz w:val="16"/>
               </w:rPr>
-              <w:t>Scaling up the evidence on challenges associated</w:t>
+              <w:t>Scaling up the evidence on Cyber Warfare</w:t>
             </w:r>
           </w:p>
         </w:tc>
@@ -1411,7 +1888,7 @@
                 <w:b w:val="0"/>
                 <w:sz w:val="16"/>
               </w:rPr>
-              <w:t>Scaled evaluation or field deployment</w:t>
+              <w:t>Multi-site study</w:t>
             </w:r>
           </w:p>
         </w:tc>
@@ -1425,7 +1902,7 @@
                 <w:b w:val="0"/>
                 <w:sz w:val="16"/>
               </w:rPr>
-              <w:t>6–18 months</w:t>
+              <w:t>1–2 years</w:t>
             </w:r>
           </w:p>
         </w:tc>
@@ -1538,10 +2015,18 @@
     <w:p>
       <w:r>
         <w:rPr>
+          <w:b/>
+          <w:i/>
+          <w:highlight w:val="yellow"/>
+        </w:rPr>
+        <w:t>[USER SHOULD VERIFY]</w:t>
+      </w:r>
+      <w:r>
+        <w:rPr>
           <w:b w:val="0"/>
           <w:i/>
         </w:rPr>
-        <w:t>Phase 4 builds this conclusion from the papers' abstracts, the review and the Phase 2 and 3 analyses; check each claim against the papers. The directions and checks are listed in cyber-warfare-conclusion-analysis.json.</w:t>
+        <w:t xml:space="preserve"> Phase 4 builds this conclusion from the papers' abstracts, the review and the Phase 2 and 3 analyses; check each claim against the papers. The directions and checks are listed in cyber-warfare-conclusion-analysis.json.</w:t>
       </w:r>
     </w:p>
     <w:p>
@@ -1558,7 +2043,7 @@
           <w:b w:val="0"/>
           <w:i w:val="0"/>
         </w:rPr>
-        <w:t>Ahmed, U., Sipola, T., &amp; Hautamäki, J. (2024). Cyber Protection Applications of Quantum Computing: A Review. arXiv. https://doi.org/10.34190/eccws.23.1.2182</w:t>
+        <w:t>Cremer, F., Sheehan, B., Mullins, M., Fortmann, M., Ryan, B. J., &amp; Materne, S. (2024). On the insurability of cyber warfare: An investigation into the German cyber insurance market. Computers &amp; security. https://doi.org/10.1016/j.cose.2024.103886</w:t>
       </w:r>
     </w:p>
     <w:p>
@@ -1567,7 +2052,7 @@
           <w:b w:val="0"/>
           <w:i w:val="0"/>
         </w:rPr>
-        <w:t>Benkő, G., &amp; Biczók, G. (2024). The Cyber Alliance Game: How Alliances Influence Cyber-Warfare. arXiv. http://arxiv.org/abs/2410.05953v1</w:t>
+        <w:t>Huang, B. (2024). Navigating digital divide: exploring the influence of ideological and political education on cyber security and digital literacy amid information warfare. Current Psychology. https://doi.org/10.1007/s12144-024-06106-1</w:t>
       </w:r>
     </w:p>
     <w:p>
@@ -1576,7 +2061,7 @@
           <w:b w:val="0"/>
           <w:i w:val="0"/>
         </w:rPr>
-        <w:t>Bouke, M., &amp; Abdullah, A. (2023). Turnkey Technology: A Powerful Tool for Cyber Warfare. arXiv. http://arxiv.org/abs/2308.14576v1</w:t>
+        <w:t>Khan, Z. (2025). Cyber Warfare and International Security: A New Geopolitical Frontier. The Critical Review of Social Sciences Studies. https://doi.org/10.59075/k9cbhz04</w:t>
       </w:r>
     </w:p>
     <w:p>
@@ -1585,7 +2070,7 @@
           <w:b w:val="0"/>
           <w:i w:val="0"/>
         </w:rPr>
-        <w:t>Celeny, D., &amp; Maréchal, L. (2024). Cyber risk and the cross-section of stock returns. arXiv. http://arxiv.org/abs/2402.04775v2</w:t>
+        <w:t>Khoirunnisa, K., &amp; Sugiati, C. (2024). Cyber Warfare Strategies in the Russia-Ukraine Conflict (2021-2022): Implications for National Security and Modern Warfare. Journal of Public Policy. https://doi.org/10.35308/jpp.v10i2.9026</w:t>
       </w:r>
     </w:p>
     <w:p>
@@ -1594,7 +2079,7 @@
           <w:b w:val="0"/>
           <w:i w:val="0"/>
         </w:rPr>
-        <w:t>Diggelen, J. v., Aidman, E., Rowa, J., &amp; Vince, J. (2025). Designing AI-Enabled Countermeasures to Cognitive Warfare. arXiv. http://arxiv.org/abs/2504.11486v1</w:t>
+        <w:t>Kumar, S., &amp; Nagar, G. (2024). Threat Modeling for Cyber Warfare Against Less Cyber-Dependent Adversaries. European Conference on Cyber Warfare and Security. https://doi.org/10.34190/eccws.23.1.2462</w:t>
       </w:r>
     </w:p>
     <w:p>
@@ -1603,7 +2088,7 @@
           <w:b w:val="0"/>
           <w:i w:val="0"/>
         </w:rPr>
-        <w:t>Ear, E., Remy, J. L. C., &amp; Xu, S. (2023). Towards Automated Cyber Range Design: Characterizing and Matching Demands to Supplies. arXiv. https://doi.org/10.1109/CSR57506.2023.10224940</w:t>
+        <w:t>Lindsay, J. (2025). Stuxnet revisited: From cyber warfare to secret statecraft. The  Journal of Strategic Studies. https://doi.org/10.1080/01402390.2025.2481447</w:t>
       </w:r>
     </w:p>
     <w:p>
@@ -1612,7 +2097,7 @@
           <w:b w:val="0"/>
           <w:i w:val="0"/>
         </w:rPr>
-        <w:t>Fernandes, Y., &amp; Abosata, N. (2024). Analysing India's Cyber Warfare Readiness and Developing a Defence Strategy. arXiv. http://arxiv.org/abs/2406.12568v1</w:t>
+        <w:t>Ma, X., Abdelfattah, W., Luo, D., Innab, N., Shutaywi, M., &amp; Deebani, W. (2024). Non-cooperative game theory with generative adversarial network for effective decision-making in military cyber warfare. Annals of Operations Research. https://doi.org/10.1007/s10479-024-06406-6</w:t>
       </w:r>
     </w:p>
     <w:p>
@@ -1621,7 +2106,7 @@
           <w:b w:val="0"/>
           <w:i w:val="0"/>
         </w:rPr>
-        <w:t>Huang, S., Poskitt, C. M., &amp; Shar, L. K. (2024). Security Modelling for Cyber-Physical Systems: A Systematic Literature Review. arXiv. https://doi.org/10.1145/3776549</w:t>
+        <w:t>Mohamed, N., Almazrouei, S. k., Oubelaid, A., Ahmed, A., Jomah, O., &amp; Aghnaiya, A. (2023). Understanding the Threat Posed by Chinese Cyber Warfare Units. 2023 IEEE 3rd International Maghreb Meeting of the Conference on Sciences and Techniques of Automatic Control and Computer Engineering (MI-STA). https://doi.org/10.1109/MI-STA57575.2023.10169496</w:t>
       </w:r>
     </w:p>
     <w:p>
@@ -1630,7 +2115,7 @@
           <w:b w:val="0"/>
           <w:i w:val="0"/>
         </w:rPr>
-        <w:t>Kiely, M., Bowman, D., Standen, M., &amp; Moir, C. (2023). On Autonomous Agents in a Cyber Defence Environment. arXiv. http://arxiv.org/abs/2309.07388v1</w:t>
+        <w:t>Mohammed, S. A. (2025). Agent-vs-Agent Cyber Warfare: Autonomous AI Systems Defending Against AI-Enabled APTs. International Journal on Advanced Computer Engineering and Communication Technology. https://doi.org/10.65521/ijacect.v14i2.926</w:t>
       </w:r>
     </w:p>
     <w:p>
@@ -1639,7 +2124,7 @@
           <w:b w:val="0"/>
           <w:i w:val="0"/>
         </w:rPr>
-        <w:t>Lau, P., Wang, L., Wei, W., Liu, Z., &amp; Ten, C. (2024). A Novel Mutual Insurance Model for Hedging Against Cyber Risks in Power Systems Deploying Smart Technologies. arXiv. https://doi.org/10.1109/TPWRS.2022.3164628</w:t>
+        <w:t>Rosli, W. (2025). Waging warfare against states: the deployment of artificial intelligence in cyber espionage. AI and Ethics. https://doi.org/10.1007/s43681-024-00628-x</w:t>
       </w:r>
     </w:p>
     <w:p>
@@ -1648,7 +2133,7 @@
           <w:b w:val="0"/>
           <w:i w:val="0"/>
         </w:rPr>
-        <w:t>Li, L., Rami, J. S. E., Kerr, R., Taylor, A., &amp; Vandenberghe, G. (2023). Towards Autonomous Cyber Operation Agents: Exploring the Red Case. arXiv. http://arxiv.org/abs/2309.02247v2</w:t>
+        <w:t>Sfetcu, N. (2024). Advanced Persistent Threats in Cybersecurity – Cyber Warfare. Social Science Research Network. https://doi.org/10.58679/mm28378</w:t>
       </w:r>
     </w:p>
     <w:p>
@@ -1657,7 +2142,7 @@
           <w:b w:val="0"/>
           <w:i w:val="0"/>
         </w:rPr>
-        <w:t>Li, T., &amp; Zhu, Q. (2024). Symbiotic Game and Foundation Models for Cyber Deception Operations in Strategic Cyber Warfare. arXiv. http://arxiv.org/abs/2403.10570v2</w:t>
+        <w:t>Siam, M. A., Shan-A-Alahi, A., Tuhin, M. K., Hossain, E., Bashir, M., Lucky, K. Y., Uddin, S. M. M., &amp; Zaiem, A. A. (2025). AI-Driven Cyber Threat Intelligence Systems: A National Framework for Proactive Defense Against Evolving Digital Warfare. International Journal of Computational and Experimental Science and Engineering. https://doi.org/10.22399/ijcesen.3793</w:t>
       </w:r>
     </w:p>
     <w:p>
@@ -1666,7 +2151,7 @@
           <w:b w:val="0"/>
           <w:i w:val="0"/>
         </w:rPr>
-        <w:t>Sánchez, G., Elbez, G., &amp; Hagenmeyer, V. (2025). A Global Analysis of Cyber Threats to the Energy Sector: "Currents of Conflict" from a Geopolitical Perspective. arXiv. https://doi.org/10.17560/atp.v67i9.2797</w:t>
+        <w:t>Unknown Author (2023). Russian cyber and information warfare in practice. https://doi.org/10.55317/9781784135898</w:t>
       </w:r>
     </w:p>
     <w:p>
@@ -1675,7 +2160,7 @@
           <w:b w:val="0"/>
           <w:i w:val="0"/>
         </w:rPr>
-        <w:t>Yang, Y., &amp; Zhu, Q. (2025). A Multi-Resolution Dynamic Game Framework for Cross-Echelon Decision-Making in Cyber Warfare. arXiv. http://arxiv.org/abs/2507.03021v1</w:t>
+        <w:t>Wang, L., &amp; Wang, R. (2024). Cyber warfare: a study of Zelenskyy’s social media political performance strategies and effects. Frontiers in Psychology. https://doi.org/10.3389/fpsyg.2024.1478639</w:t>
       </w:r>
     </w:p>
     <w:p>
@@ -1684,7 +2169,7 @@
           <w:b w:val="0"/>
           <w:i w:val="0"/>
         </w:rPr>
-        <w:t>Yang, Y., &amp; Zhu, Q. (2025). Toward a Multi-Echelon Cyber Warfare Theory: A Meta-Game-Theoretic Paradigm for Defense and Dominance. arXiv. http://arxiv.org/abs/2509.08976v2</w:t>
+        <w:t>Žilinčík, S., &amp; Duyvesteyn, I. (2023). Strategic studies and cyber warfare. The  Journal of Strategic Studies. https://doi.org/10.1080/01402390.2023.2174106</w:t>
       </w:r>
     </w:p>
     <w:sectPr>

</xml_diff>